<commit_message>
docs: update D7 docs for trial-run bug fixes (99/99 tests)
Add ChangeLog entry for commit 70889a9 (legacy-autosave recovery and
_scheduled-set sync fix). Update test counts from 98/98 to 99/99 in
Testing_and_QA_Summary and Handoff_Checklist verification log. Update
stakeholder-data smoke-test row to reflect that a full live-data trial
run was conducted. Re-render docx and pdf artifacts.
</commit_message>
<xml_diff>
--- a/Project_Docs_D7/ChangeLog_and_Version_History.docx
+++ b/Project_Docs_D7/ChangeLog_and_Version_History.docx
@@ -2,7 +2,7 @@
 <file path=word/document.xml><?xml version="1.0" encoding="utf-8"?>
 <w:document xmlns:w="http://schemas.openxmlformats.org/wordprocessingml/2006/main" xmlns:m="http://schemas.openxmlformats.org/officeDocument/2006/math" xmlns:r="http://schemas.openxmlformats.org/officeDocument/2006/relationships" xmlns:o="urn:schemas-microsoft-com:office:office" xmlns:v="urn:schemas-microsoft-com:vml" xmlns:w10="urn:schemas-microsoft-com:office:word" xmlns:a="http://schemas.openxmlformats.org/drawingml/2006/main" xmlns:pic="http://schemas.openxmlformats.org/drawingml/2006/picture" xmlns:wp="http://schemas.openxmlformats.org/drawingml/2006/wordprocessingDrawing">
   <w:body>
-    <w:bookmarkStart w:id="24" w:name="changelog-and-version-history"/>
+    <w:bookmarkStart w:id="23" w:name="changelog-and-version-history"/>
     <w:p>
       <w:pPr>
         <w:pStyle w:val="Heading1"/>
@@ -41,14 +41,9 @@
       <w:r>
         <w:t xml:space="preserve"> </w:t>
       </w:r>
-      <w:hyperlink r:id="rId9">
-        <w:r>
-          <w:rPr>
-            <w:rStyle w:val="Hyperlink"/>
-          </w:rPr>
-          <w:t xml:space="preserve">https://github.com/Omnilore-DB/Scheduler</w:t>
-        </w:r>
-      </w:hyperlink>
+      <w:r>
+        <w:t xml:space="preserve">https://github.com/Omnilore-DB/Scheduler</w:t>
+      </w:r>
       <w:r>
         <w:t xml:space="preserve"> </w:t>
       </w:r>
@@ -74,7 +69,7 @@
         <w:pStyle w:val="BodyText"/>
       </w:pPr>
       <w:r>
-        <w:t xml:space="preserve">This is the project-level change log for CSCI 401 Team 34's 2026 contribution to the Omnilore Scheduler. For program-behavior deviations from the previous desktop application (e.g., 6-class support, mail-merge column changes), see the repository-root</w:t>
+        <w:t xml:space="preserve">This is the project-level change log for CSCI 401 Team 34’s 2026 contribution to the Omnilore Scheduler. For program-behavior deviations from the previous desktop application (e.g., 6-class support, mail-merge column changes), see the repository-root</w:t>
       </w:r>
       <w:r>
         <w:t xml:space="preserve"> </w:t>
@@ -89,7 +84,7 @@
         <w:t xml:space="preserve">.</w:t>
       </w:r>
     </w:p>
-    <w:bookmarkStart w:id="10" w:name="how-to-tag-the-final-d7-release"/>
+    <w:bookmarkStart w:id="9" w:name="how-to-tag-the-final-d7-release"/>
     <w:p>
       <w:pPr>
         <w:pStyle w:val="Heading2"/>
@@ -297,8 +292,8 @@
         <w:t xml:space="preserve">once the tag exists.</w:t>
       </w:r>
     </w:p>
-    <w:bookmarkEnd w:id="10"/>
-    <w:bookmarkStart w:id="19" w:name="per-deliverable-history"/>
+    <w:bookmarkEnd w:id="9"/>
+    <w:bookmarkStart w:id="17" w:name="per-deliverable-history"/>
     <w:p>
       <w:pPr>
         <w:pStyle w:val="Heading2"/>
@@ -307,7 +302,7 @@
         <w:t xml:space="preserve">Per-deliverable history</w:t>
       </w:r>
     </w:p>
-    <w:bookmarkStart w:id="11" w:name="Xbcd7ca5cf56747f2c69734a610b12778be0a89e"/>
+    <w:bookmarkStart w:id="10" w:name="X960f8c9e5f8420129da4c96d20735521195a190"/>
     <w:p>
       <w:pPr>
         <w:pStyle w:val="Heading3"/>
@@ -434,82 +429,263 @@
         <w:t xml:space="preserve">Prospective schedule for D2–D7 published.</w:t>
       </w:r>
     </w:p>
+    <w:bookmarkEnd w:id="10"/>
+    <w:bookmarkStart w:id="11" w:name="Xa4484db84d49d87387aeb70f0d2d0dc9353c0de"/>
+    <w:p>
+      <w:pPr>
+        <w:pStyle w:val="Heading3"/>
+      </w:pPr>
+      <w:r>
+        <w:t xml:space="preserve">Deliverable 2 — Codebase review and plan (submitted 2026-02-08)</w:t>
+      </w:r>
+    </w:p>
+    <w:p>
+      <w:pPr>
+        <w:pStyle w:val="Compact"/>
+        <w:numPr>
+          <w:ilvl w:val="0"/>
+          <w:numId w:val="1003"/>
+        </w:numPr>
+      </w:pPr>
+      <w:r>
+        <w:t xml:space="preserve">Local environments set up; existing Flutter desktop codebase reviewed.</w:t>
+      </w:r>
+    </w:p>
+    <w:p>
+      <w:pPr>
+        <w:pStyle w:val="Compact"/>
+        <w:numPr>
+          <w:ilvl w:val="0"/>
+          <w:numId w:val="1003"/>
+        </w:numPr>
+      </w:pPr>
+      <w:r>
+        <w:t xml:space="preserve">Web-porting feasibility confirmed;</w:t>
+      </w:r>
+      <w:r>
+        <w:t xml:space="preserve"> </w:t>
+      </w:r>
+      <w:r>
+        <w:rPr>
+          <w:rStyle w:val="VerbatimChar"/>
+        </w:rPr>
+        <w:t xml:space="preserve">dart:io</w:t>
+      </w:r>
+      <w:r>
+        <w:t xml:space="preserve">,</w:t>
+      </w:r>
+      <w:r>
+        <w:t xml:space="preserve"> </w:t>
+      </w:r>
+      <w:r>
+        <w:rPr>
+          <w:rStyle w:val="VerbatimChar"/>
+        </w:rPr>
+        <w:t xml:space="preserve">desktop_window</w:t>
+      </w:r>
+      <w:r>
+        <w:t xml:space="preserve">, and OS file dialogs identified as the conversion blockers.</w:t>
+      </w:r>
+    </w:p>
+    <w:p>
+      <w:pPr>
+        <w:pStyle w:val="Compact"/>
+        <w:numPr>
+          <w:ilvl w:val="0"/>
+          <w:numId w:val="1003"/>
+        </w:numPr>
+      </w:pPr>
+      <w:r>
+        <w:t xml:space="preserve">Task breakdown and per-developer assignments finalized.</w:t>
+      </w:r>
+    </w:p>
+    <w:p>
+      <w:pPr>
+        <w:pStyle w:val="Compact"/>
+        <w:numPr>
+          <w:ilvl w:val="0"/>
+          <w:numId w:val="1003"/>
+        </w:numPr>
+      </w:pPr>
+      <w:r>
+        <w:t xml:space="preserve">Working notes:</w:t>
+      </w:r>
+      <w:r>
+        <w:t xml:space="preserve"> </w:t>
+      </w:r>
+      <w:r>
+        <w:rPr>
+          <w:rStyle w:val="VerbatimChar"/>
+        </w:rPr>
+        <w:t xml:space="preserve">docs/deliverable2_codebase_review.md</w:t>
+      </w:r>
+      <w:r>
+        <w:t xml:space="preserve">,</w:t>
+      </w:r>
+      <w:r>
+        <w:t xml:space="preserve"> </w:t>
+      </w:r>
+      <w:r>
+        <w:rPr>
+          <w:rStyle w:val="VerbatimChar"/>
+        </w:rPr>
+        <w:t xml:space="preserve">docs/platform_gating_rules.md</w:t>
+      </w:r>
+      <w:r>
+        <w:t xml:space="preserve">.</w:t>
+      </w:r>
+    </w:p>
     <w:bookmarkEnd w:id="11"/>
-    <w:bookmarkStart w:id="12" w:name="X1b320c0773d017b6441372c91df376a7ae5245a"/>
+    <w:bookmarkStart w:id="12" w:name="X0c3965ca41f7aed8503942908fe2257d6a4a6df"/>
     <w:p>
       <w:pPr>
         <w:pStyle w:val="Heading3"/>
       </w:pPr>
       <w:r>
-        <w:t xml:space="preserve">Deliverable 2 — Codebase review and plan (submitted 2026-02-08)</w:t>
-      </w:r>
-    </w:p>
-    <w:p>
-      <w:pPr>
-        <w:pStyle w:val="Compact"/>
-        <w:numPr>
-          <w:ilvl w:val="0"/>
-          <w:numId w:val="1003"/>
-        </w:numPr>
-      </w:pPr>
-      <w:r>
-        <w:t xml:space="preserve">Local environments set up; existing Flutter desktop codebase reviewed.</w:t>
-      </w:r>
-    </w:p>
-    <w:p>
-      <w:pPr>
-        <w:pStyle w:val="Compact"/>
-        <w:numPr>
-          <w:ilvl w:val="0"/>
-          <w:numId w:val="1003"/>
-        </w:numPr>
-      </w:pPr>
-      <w:r>
-        <w:t xml:space="preserve">Web-porting feasibility confirmed;</w:t>
-      </w:r>
-      <w:r>
-        <w:t xml:space="preserve"> </w:t>
-      </w:r>
-      <w:r>
-        <w:rPr>
-          <w:rStyle w:val="VerbatimChar"/>
-        </w:rPr>
-        <w:t xml:space="preserve">dart:io</w:t>
-      </w:r>
-      <w:r>
-        <w:t xml:space="preserve">,</w:t>
-      </w:r>
-      <w:r>
-        <w:t xml:space="preserve"> </w:t>
-      </w:r>
-      <w:r>
-        <w:rPr>
-          <w:rStyle w:val="VerbatimChar"/>
-        </w:rPr>
-        <w:t xml:space="preserve">desktop_window</w:t>
-      </w:r>
-      <w:r>
-        <w:t xml:space="preserve">, and OS file dialogs identified as the conversion blockers.</w:t>
-      </w:r>
-    </w:p>
-    <w:p>
-      <w:pPr>
-        <w:pStyle w:val="Compact"/>
-        <w:numPr>
-          <w:ilvl w:val="0"/>
-          <w:numId w:val="1003"/>
-        </w:numPr>
-      </w:pPr>
-      <w:r>
-        <w:t xml:space="preserve">Task breakdown and per-developer assignments finalized.</w:t>
-      </w:r>
-    </w:p>
-    <w:p>
-      <w:pPr>
-        <w:pStyle w:val="Compact"/>
-        <w:numPr>
-          <w:ilvl w:val="0"/>
-          <w:numId w:val="1003"/>
+        <w:t xml:space="preserve">Deliverable 3 — Web migration begins (submitted 2026-02-22)</w:t>
+      </w:r>
+    </w:p>
+    <w:p>
+      <w:pPr>
+        <w:pStyle w:val="Compact"/>
+        <w:numPr>
+          <w:ilvl w:val="0"/>
+          <w:numId w:val="1004"/>
+        </w:numPr>
+      </w:pPr>
+      <w:r>
+        <w:t xml:space="preserve">First Flutter Web build runs.</w:t>
+      </w:r>
+    </w:p>
+    <w:p>
+      <w:pPr>
+        <w:pStyle w:val="Compact"/>
+        <w:numPr>
+          <w:ilvl w:val="0"/>
+          <w:numId w:val="1004"/>
+        </w:numPr>
+      </w:pPr>
+      <w:r>
+        <w:t xml:space="preserve">Conditional-import pattern adopted for I/O, downloads, autosave, and window sizing (</w:t>
+      </w:r>
+      <w:r>
+        <w:rPr>
+          <w:rStyle w:val="VerbatimChar"/>
+        </w:rPr>
+        <w:t xml:space="preserve">*_factory.dart</w:t>
+      </w:r>
+      <w:r>
+        <w:t xml:space="preserve"> </w:t>
+      </w:r>
+      <w:r>
+        <w:t xml:space="preserve">+</w:t>
+      </w:r>
+      <w:r>
+        <w:t xml:space="preserve"> </w:t>
+      </w:r>
+      <w:r>
+        <w:rPr>
+          <w:rStyle w:val="VerbatimChar"/>
+        </w:rPr>
+        <w:t xml:space="preserve">*_stub.dart</w:t>
+      </w:r>
+      <w:r>
+        <w:t xml:space="preserve"> </w:t>
+      </w:r>
+      <w:r>
+        <w:t xml:space="preserve">+</w:t>
+      </w:r>
+      <w:r>
+        <w:t xml:space="preserve"> </w:t>
+      </w:r>
+      <w:r>
+        <w:rPr>
+          <w:rStyle w:val="VerbatimChar"/>
+        </w:rPr>
+        <w:t xml:space="preserve">*_io.dart</w:t>
+      </w:r>
+      <w:r>
+        <w:t xml:space="preserve"> </w:t>
+      </w:r>
+      <w:r>
+        <w:t xml:space="preserve">/</w:t>
+      </w:r>
+      <w:r>
+        <w:t xml:space="preserve"> </w:t>
+      </w:r>
+      <w:r>
+        <w:rPr>
+          <w:rStyle w:val="VerbatimChar"/>
+        </w:rPr>
+        <w:t xml:space="preserve">*_web.dart</w:t>
+      </w:r>
+      <w:r>
+        <w:t xml:space="preserve"> </w:t>
+      </w:r>
+      <w:r>
+        <w:t xml:space="preserve">triples).</w:t>
+      </w:r>
+    </w:p>
+    <w:p>
+      <w:pPr>
+        <w:pStyle w:val="Compact"/>
+        <w:numPr>
+          <w:ilvl w:val="0"/>
+          <w:numId w:val="1004"/>
+        </w:numPr>
+      </w:pPr>
+      <w:r>
+        <w:rPr>
+          <w:rStyle w:val="VerbatimChar"/>
+        </w:rPr>
+        <w:t xml:space="preserve">scripts/check_platform_gating.sh</w:t>
+      </w:r>
+      <w:r>
+        <w:t xml:space="preserve"> </w:t>
+      </w:r>
+      <w:r>
+        <w:t xml:space="preserve">introduced as a static guard; matched by</w:t>
+      </w:r>
+      <w:r>
+        <w:t xml:space="preserve"> </w:t>
+      </w:r>
+      <w:r>
+        <w:rPr>
+          <w:rStyle w:val="VerbatimChar"/>
+        </w:rPr>
+        <w:t xml:space="preserve">test/platform_gating_test.dart</w:t>
+      </w:r>
+      <w:r>
+        <w:t xml:space="preserve">.</w:t>
+      </w:r>
+    </w:p>
+    <w:p>
+      <w:pPr>
+        <w:pStyle w:val="Compact"/>
+        <w:numPr>
+          <w:ilvl w:val="0"/>
+          <w:numId w:val="1004"/>
+        </w:numPr>
+      </w:pPr>
+      <w:r>
+        <w:t xml:space="preserve">Initial CI (</w:t>
+      </w:r>
+      <w:r>
+        <w:rPr>
+          <w:rStyle w:val="VerbatimChar"/>
+        </w:rPr>
+        <w:t xml:space="preserve">.github/workflows/test.yml</w:t>
+      </w:r>
+      <w:r>
+        <w:t xml:space="preserve">) introduced: gating check + analyze + test.</w:t>
+      </w:r>
+    </w:p>
+    <w:p>
+      <w:pPr>
+        <w:pStyle w:val="Compact"/>
+        <w:numPr>
+          <w:ilvl w:val="0"/>
+          <w:numId w:val="1004"/>
         </w:numPr>
       </w:pPr>
       <w:r>
@@ -522,195 +698,14 @@
         <w:rPr>
           <w:rStyle w:val="VerbatimChar"/>
         </w:rPr>
-        <w:t xml:space="preserve">docs/deliverable2_codebase_review.md</w:t>
-      </w:r>
-      <w:r>
-        <w:t xml:space="preserve">,</w:t>
-      </w:r>
-      <w:r>
-        <w:t xml:space="preserve"> </w:t>
-      </w:r>
-      <w:r>
-        <w:rPr>
-          <w:rStyle w:val="VerbatimChar"/>
-        </w:rPr>
-        <w:t xml:space="preserve">docs/platform_gating_rules.md</w:t>
+        <w:t xml:space="preserve">docs/deliverable3_progress_update.md</w:t>
       </w:r>
       <w:r>
         <w:t xml:space="preserve">.</w:t>
       </w:r>
     </w:p>
     <w:bookmarkEnd w:id="12"/>
-    <w:bookmarkStart w:id="13" w:name="X29402ca0abd61d5eec0f7d25b44652b97325609"/>
-    <w:p>
-      <w:pPr>
-        <w:pStyle w:val="Heading3"/>
-      </w:pPr>
-      <w:r>
-        <w:t xml:space="preserve">Deliverable 3 — Web migration begins (submitted 2026-02-22)</w:t>
-      </w:r>
-    </w:p>
-    <w:p>
-      <w:pPr>
-        <w:pStyle w:val="Compact"/>
-        <w:numPr>
-          <w:ilvl w:val="0"/>
-          <w:numId w:val="1004"/>
-        </w:numPr>
-      </w:pPr>
-      <w:r>
-        <w:t xml:space="preserve">First Flutter Web build runs.</w:t>
-      </w:r>
-    </w:p>
-    <w:p>
-      <w:pPr>
-        <w:pStyle w:val="Compact"/>
-        <w:numPr>
-          <w:ilvl w:val="0"/>
-          <w:numId w:val="1004"/>
-        </w:numPr>
-      </w:pPr>
-      <w:r>
-        <w:t xml:space="preserve">Conditional-import pattern adopted for I/O, downloads, autosave, and window sizing (</w:t>
-      </w:r>
-      <w:r>
-        <w:rPr>
-          <w:rStyle w:val="VerbatimChar"/>
-        </w:rPr>
-        <w:t xml:space="preserve">*_factory.dart</w:t>
-      </w:r>
-      <w:r>
-        <w:t xml:space="preserve"> </w:t>
-      </w:r>
-      <w:r>
-        <w:t xml:space="preserve">+</w:t>
-      </w:r>
-      <w:r>
-        <w:t xml:space="preserve"> </w:t>
-      </w:r>
-      <w:r>
-        <w:rPr>
-          <w:rStyle w:val="VerbatimChar"/>
-        </w:rPr>
-        <w:t xml:space="preserve">*_stub.dart</w:t>
-      </w:r>
-      <w:r>
-        <w:t xml:space="preserve"> </w:t>
-      </w:r>
-      <w:r>
-        <w:t xml:space="preserve">+</w:t>
-      </w:r>
-      <w:r>
-        <w:t xml:space="preserve"> </w:t>
-      </w:r>
-      <w:r>
-        <w:rPr>
-          <w:rStyle w:val="VerbatimChar"/>
-        </w:rPr>
-        <w:t xml:space="preserve">*_io.dart</w:t>
-      </w:r>
-      <w:r>
-        <w:t xml:space="preserve"> </w:t>
-      </w:r>
-      <w:r>
-        <w:t xml:space="preserve">/</w:t>
-      </w:r>
-      <w:r>
-        <w:t xml:space="preserve"> </w:t>
-      </w:r>
-      <w:r>
-        <w:rPr>
-          <w:rStyle w:val="VerbatimChar"/>
-        </w:rPr>
-        <w:t xml:space="preserve">*_web.dart</w:t>
-      </w:r>
-      <w:r>
-        <w:t xml:space="preserve"> </w:t>
-      </w:r>
-      <w:r>
-        <w:t xml:space="preserve">triples).</w:t>
-      </w:r>
-    </w:p>
-    <w:p>
-      <w:pPr>
-        <w:pStyle w:val="Compact"/>
-        <w:numPr>
-          <w:ilvl w:val="0"/>
-          <w:numId w:val="1004"/>
-        </w:numPr>
-      </w:pPr>
-      <w:r>
-        <w:rPr>
-          <w:rStyle w:val="VerbatimChar"/>
-        </w:rPr>
-        <w:t xml:space="preserve">scripts/check_platform_gating.sh</w:t>
-      </w:r>
-      <w:r>
-        <w:t xml:space="preserve"> </w:t>
-      </w:r>
-      <w:r>
-        <w:t xml:space="preserve">introduced as a static guard; matched by</w:t>
-      </w:r>
-      <w:r>
-        <w:t xml:space="preserve"> </w:t>
-      </w:r>
-      <w:r>
-        <w:rPr>
-          <w:rStyle w:val="VerbatimChar"/>
-        </w:rPr>
-        <w:t xml:space="preserve">test/platform_gating_test.dart</w:t>
-      </w:r>
-      <w:r>
-        <w:t xml:space="preserve">.</w:t>
-      </w:r>
-    </w:p>
-    <w:p>
-      <w:pPr>
-        <w:pStyle w:val="Compact"/>
-        <w:numPr>
-          <w:ilvl w:val="0"/>
-          <w:numId w:val="1004"/>
-        </w:numPr>
-      </w:pPr>
-      <w:r>
-        <w:t xml:space="preserve">Initial CI (</w:t>
-      </w:r>
-      <w:r>
-        <w:rPr>
-          <w:rStyle w:val="VerbatimChar"/>
-        </w:rPr>
-        <w:t xml:space="preserve">.github/workflows/test.yml</w:t>
-      </w:r>
-      <w:r>
-        <w:t xml:space="preserve">) introduced: gating check + analyze + test.</w:t>
-      </w:r>
-    </w:p>
-    <w:p>
-      <w:pPr>
-        <w:pStyle w:val="Compact"/>
-        <w:numPr>
-          <w:ilvl w:val="0"/>
-          <w:numId w:val="1004"/>
-        </w:numPr>
-      </w:pPr>
-      <w:r>
-        <w:t xml:space="preserve">Working notes:</w:t>
-      </w:r>
-      <w:r>
-        <w:t xml:space="preserve"> </w:t>
-      </w:r>
-      <w:r>
-        <w:rPr>
-          <w:rStyle w:val="VerbatimChar"/>
-        </w:rPr>
-        <w:t xml:space="preserve">docs/deliverable3_progress_update.md</w:t>
-      </w:r>
-      <w:r>
-        <w:t xml:space="preserve">.</w:t>
-      </w:r>
-    </w:p>
-    <w:bookmarkEnd w:id="13"/>
-    <w:bookmarkStart w:id="14" w:name="X094d5a3b33fee70be92ecd2be3722dc9660a5a8"/>
+    <w:bookmarkStart w:id="13" w:name="X5099b3a2305450466667a210b1aa9c5468e0f75"/>
     <w:p>
       <w:pPr>
         <w:pStyle w:val="Heading3"/>
@@ -947,8 +942,8 @@
         <w:t xml:space="preserve">.</w:t>
       </w:r>
     </w:p>
-    <w:bookmarkEnd w:id="14"/>
-    <w:bookmarkStart w:id="15" w:name="X91902db2fbf9c9fc27e3d6c92d988312ffd57da"/>
+    <w:bookmarkEnd w:id="13"/>
+    <w:bookmarkStart w:id="14" w:name="X406350d3d9243d4a0939d934dcaa8cc1497ccc0"/>
     <w:p>
       <w:pPr>
         <w:pStyle w:val="Heading3"/>
@@ -1146,8 +1141,8 @@
         <w:t xml:space="preserve">.</w:t>
       </w:r>
     </w:p>
-    <w:bookmarkEnd w:id="15"/>
-    <w:bookmarkStart w:id="16" w:name="X458baabbe7502ea6b6c2d339e45ff765eb6b1f2"/>
+    <w:bookmarkEnd w:id="14"/>
+    <w:bookmarkStart w:id="15" w:name="X7e90dff7f8876770a25f10f12efc52e98ed14e1"/>
     <w:p>
       <w:pPr>
         <w:pStyle w:val="Heading3"/>
@@ -1472,8 +1467,8 @@
         <w:t xml:space="preserve">(pass with non-blocking advisories).</w:t>
       </w:r>
     </w:p>
-    <w:bookmarkEnd w:id="16"/>
-    <w:bookmarkStart w:id="18" w:name="Xdb6f61c5b4282fa72630984bbc8dd0785979a84"/>
+    <w:bookmarkEnd w:id="15"/>
+    <w:bookmarkStart w:id="16" w:name="X0c91a9a507b577d91ea51220dada2e0eada0497"/>
     <w:p>
       <w:pPr>
         <w:pStyle w:val="Heading3"/>
@@ -1742,21 +1737,7 @@
         <w:t xml:space="preserve"> </w:t>
       </w:r>
       <w:r>
-        <w:t xml:space="preserve">confirmed:</w:t>
-      </w:r>
-      <w:r>
-        <w:t xml:space="preserve"> </w:t>
-      </w:r>
-      <w:hyperlink r:id="rId17">
-        <w:r>
-          <w:rPr>
-            <w:rStyle w:val="Hyperlink"/>
-          </w:rPr>
-          <w:t xml:space="preserve">http://scheduler.omnilore.org</w:t>
-        </w:r>
-      </w:hyperlink>
-      <w:r>
-        <w:t xml:space="preserve">.</w:t>
+        <w:t xml:space="preserve">confirmed: http://scheduler.omnilore.org.</w:t>
       </w:r>
     </w:p>
     <w:p>
@@ -1897,15 +1878,15 @@
         <w:t xml:space="preserve">§P0 / §P1.</w:t>
       </w:r>
     </w:p>
-    <w:bookmarkEnd w:id="18"/>
-    <w:bookmarkEnd w:id="19"/>
-    <w:bookmarkStart w:id="20" w:name="Xf6bacbc27108d74b4162fa5291bc72fe3674a23"/>
+    <w:bookmarkEnd w:id="16"/>
+    <w:bookmarkEnd w:id="17"/>
+    <w:bookmarkStart w:id="18" w:name="Xd6d5ee835096bf86497453f58806e638473ae18"/>
     <w:p>
       <w:pPr>
         <w:pStyle w:val="Heading2"/>
       </w:pPr>
       <w:r>
-        <w:t xml:space="preserve">Behavior changes vs. the previous desktop application</w:t>
+        <w:t xml:space="preserve">Behavior changes vs. the previous desktop application</w:t>
       </w:r>
     </w:p>
     <w:p>
@@ -2059,8 +2040,8 @@
         <w:t xml:space="preserve">has nine extra columns per row to accommodate &gt;3 wanted classes.</w:t>
       </w:r>
     </w:p>
-    <w:bookmarkEnd w:id="20"/>
-    <w:bookmarkStart w:id="22" w:name="repository-revisions-of-note"/>
+    <w:bookmarkEnd w:id="18"/>
+    <w:bookmarkStart w:id="21" w:name="repository-revisions-of-note"/>
     <w:p>
       <w:pPr>
         <w:pStyle w:val="Heading2"/>
@@ -2072,7 +2053,8 @@
     <w:tbl>
       <w:tblPr>
         <w:tblStyle w:val="Table"/>
-        <w:tblW w:type="auto" w:w="0"/>
+        <w:tblW w:type="pct" w:w="5000"/>
+        <w:tblLayout w:type="fixed"/>
         <w:tblLook w:firstRow="1" w:lastRow="0" w:firstColumn="0" w:lastColumn="0" w:noHBand="0" w:noVBand="0" w:val="0020"/>
       </w:tblPr>
       <w:tblGrid>
@@ -2275,7 +2257,7 @@
         </w:tc>
       </w:tr>
     </w:tbl>
-    <w:bookmarkStart w:id="21" w:name="X392a30ef75f88203211bb874f95343225b9b828"/>
+    <w:bookmarkStart w:id="19" w:name="Xc821bbe6906b757e324f0e2451ad11504dd6992"/>
     <w:p>
       <w:pPr>
         <w:pStyle w:val="Heading3"/>
@@ -2340,7 +2322,19 @@
         <w:t xml:space="preserve"> </w:t>
       </w:r>
       <w:r>
-        <w:t xml:space="preserve">Stuck "Restoring session…" spinner; restored sessions that could not continue the workflow; empty TXT exports after restore.</w:t>
+        <w:t xml:space="preserve">Stuck</w:t>
+      </w:r>
+      <w:r>
+        <w:t xml:space="preserve"> </w:t>
+      </w:r>
+      <w:r>
+        <w:t xml:space="preserve">“Restoring session…”</w:t>
+      </w:r>
+      <w:r>
+        <w:t xml:space="preserve"> </w:t>
+      </w:r>
+      <w:r>
+        <w:t xml:space="preserve">spinner; restored sessions that could not continue the workflow; empty TXT exports after restore.</w:t>
       </w:r>
     </w:p>
     <w:p>
@@ -2536,15 +2530,26 @@
         <w:t xml:space="preserve">21 test files, 98/98 passing. Static analysis clean. Web release and Wasm builds pass.</w:t>
       </w:r>
     </w:p>
-    <w:bookmarkEnd w:id="21"/>
-    <w:bookmarkEnd w:id="22"/>
-    <w:bookmarkStart w:id="23" w:name="how-to-write-a-new-entry"/>
-    <w:p>
-      <w:pPr>
-        <w:pStyle w:val="Heading2"/>
-      </w:pPr>
-      <w:r>
-        <w:t xml:space="preserve">How to write a new entry</w:t>
+    <w:bookmarkEnd w:id="19"/>
+    <w:bookmarkStart w:id="20" w:name="X3c98ca6721772785935f136fdedfa2991c3069c"/>
+    <w:p>
+      <w:pPr>
+        <w:pStyle w:val="Heading3"/>
+      </w:pPr>
+      <w:r>
+        <w:t xml:space="preserve">Post-D7 patch — Trial-run bug fixes (2026-04-30, commit</w:t>
+      </w:r>
+      <w:r>
+        <w:t xml:space="preserve"> </w:t>
+      </w:r>
+      <w:r>
+        <w:rPr>
+          <w:rStyle w:val="VerbatimChar"/>
+        </w:rPr>
+        <w:t xml:space="preserve">70889a9</w:t>
+      </w:r>
+      <w:r>
+        <w:t xml:space="preserve">)</w:t>
       </w:r>
     </w:p>
     <w:p>
@@ -2552,16 +2557,467 @@
         <w:pStyle w:val="FirstParagraph"/>
       </w:pPr>
       <w:r>
-        <w:t xml:space="preserve">When a new feature lands post-handoff, append an entry under a new heading</w:t>
-      </w:r>
-      <w:r>
-        <w:t xml:space="preserve"> </w:t>
-      </w:r>
+        <w:t xml:space="preserve">Discovered during a full trial run with live stakeholder data (</w:t>
+      </w:r>
+      <w:r>
+        <w:rPr>
+          <w:rStyle w:val="VerbatimChar"/>
+        </w:rPr>
+        <w:t xml:space="preserve">scheduling_state_2026-04-30_1601.txt</w:t>
+      </w:r>
+      <w:r>
+        <w:t xml:space="preserve">, 152-person / 25-course term).</w:t>
+      </w:r>
+    </w:p>
+    <w:p>
+      <w:pPr>
+        <w:pStyle w:val="Compact"/>
+        <w:numPr>
+          <w:ilvl w:val="0"/>
+          <w:numId w:val="1013"/>
+        </w:numPr>
+      </w:pPr>
       <w:r>
         <w:rPr>
           <w:b/>
           <w:bCs/>
         </w:rPr>
+        <w:t xml:space="preserve">Bug 1 — Legacy autosave format caused FormatException on restore.</w:t>
+      </w:r>
+      <w:r>
+        <w:t xml:space="preserve"> </w:t>
+      </w:r>
+      <w:r>
+        <w:t xml:space="preserve">The autosave stored in browser</w:t>
+      </w:r>
+      <w:r>
+        <w:t xml:space="preserve"> </w:t>
+      </w:r>
+      <w:r>
+        <w:rPr>
+          <w:rStyle w:val="VerbatimChar"/>
+        </w:rPr>
+        <w:t xml:space="preserve">localStorage</w:t>
+      </w:r>
+      <w:r>
+        <w:t xml:space="preserve"> </w:t>
+      </w:r>
+      <w:r>
+        <w:t xml:space="preserve">by an older app version contained a</w:t>
+      </w:r>
+      <w:r>
+        <w:t xml:space="preserve"> </w:t>
+      </w:r>
+      <w:r>
+        <w:rPr>
+          <w:rStyle w:val="VerbatimChar"/>
+        </w:rPr>
+        <w:t xml:space="preserve">CourseFile:</w:t>
+      </w:r>
+      <w:r>
+        <w:t xml:space="preserve"> </w:t>
+      </w:r>
+      <w:r>
+        <w:t xml:space="preserve">section header but no</w:t>
+      </w:r>
+      <w:r>
+        <w:t xml:space="preserve"> </w:t>
+      </w:r>
+      <w:r>
+        <w:rPr>
+          <w:rStyle w:val="VerbatimChar"/>
+        </w:rPr>
+        <w:t xml:space="preserve">PeopleFile:</w:t>
+      </w:r>
+      <w:r>
+        <w:t xml:space="preserve"> </w:t>
+      </w:r>
+      <w:r>
+        <w:t xml:space="preserve">section header.</w:t>
+      </w:r>
+      <w:r>
+        <w:t xml:space="preserve"> </w:t>
+      </w:r>
+      <w:r>
+        <w:rPr>
+          <w:rStyle w:val="VerbatimChar"/>
+        </w:rPr>
+        <w:t xml:space="preserve">parseBundledStateContent</w:t>
+      </w:r>
+      <w:r>
+        <w:t xml:space="preserve"> </w:t>
+      </w:r>
+      <w:r>
+        <w:t xml:space="preserve">treated the missing</w:t>
+      </w:r>
+      <w:r>
+        <w:t xml:space="preserve"> </w:t>
+      </w:r>
+      <w:r>
+        <w:rPr>
+          <w:rStyle w:val="VerbatimChar"/>
+        </w:rPr>
+        <w:t xml:space="preserve">PeopleFile:</w:t>
+      </w:r>
+      <w:r>
+        <w:t xml:space="preserve"> </w:t>
+      </w:r>
+      <w:r>
+        <w:t xml:space="preserve">as always-fatal, throwing</w:t>
+      </w:r>
+      <w:r>
+        <w:t xml:space="preserve"> </w:t>
+      </w:r>
+      <w:r>
+        <w:rPr>
+          <w:rStyle w:val="VerbatimChar"/>
+        </w:rPr>
+        <w:t xml:space="preserve">FormatException: Saved file is missing the PeopleFile section.</w:t>
+      </w:r>
+      <w:r>
+        <w:t xml:space="preserve"> </w:t>
+      </w:r>
+      <w:r>
+        <w:t xml:space="preserve">on every open of the app. Fix: when</w:t>
+      </w:r>
+      <w:r>
+        <w:t xml:space="preserve"> </w:t>
+      </w:r>
+      <w:r>
+        <w:rPr>
+          <w:rStyle w:val="VerbatimChar"/>
+        </w:rPr>
+        <w:t xml:space="preserve">PeopleFile:</w:t>
+      </w:r>
+      <w:r>
+        <w:t xml:space="preserve"> </w:t>
+      </w:r>
+      <w:r>
+        <w:t xml:space="preserve">is absent but</w:t>
+      </w:r>
+      <w:r>
+        <w:t xml:space="preserve"> </w:t>
+      </w:r>
+      <w:r>
+        <w:rPr>
+          <w:rStyle w:val="VerbatimChar"/>
+        </w:rPr>
+        <w:t xml:space="preserve">Setting:</w:t>
+      </w:r>
+      <w:r>
+        <w:t xml:space="preserve"> </w:t>
+      </w:r>
+      <w:r>
+        <w:t xml:space="preserve">is present, recover gracefully — return the embedded course data with</w:t>
+      </w:r>
+      <w:r>
+        <w:t xml:space="preserve"> </w:t>
+      </w:r>
+      <w:r>
+        <w:rPr>
+          <w:rStyle w:val="VerbatimChar"/>
+        </w:rPr>
+        <w:t xml:space="preserve">peopleData = null</w:t>
+      </w:r>
+      <w:r>
+        <w:t xml:space="preserve"> </w:t>
+      </w:r>
+      <w:r>
+        <w:t xml:space="preserve">so</w:t>
+      </w:r>
+      <w:r>
+        <w:t xml:space="preserve"> </w:t>
+      </w:r>
+      <w:r>
+        <w:rPr>
+          <w:rStyle w:val="VerbatimChar"/>
+        </w:rPr>
+        <w:t xml:space="preserve">hasEmbeddedSourceData</w:t>
+      </w:r>
+      <w:r>
+        <w:t xml:space="preserve"> </w:t>
+      </w:r>
+      <w:r>
+        <w:t xml:space="preserve">is false and the caller falls back to autosave / in-memory people data. Only when both</w:t>
+      </w:r>
+      <w:r>
+        <w:t xml:space="preserve"> </w:t>
+      </w:r>
+      <w:r>
+        <w:rPr>
+          <w:rStyle w:val="VerbatimChar"/>
+        </w:rPr>
+        <w:t xml:space="preserve">PeopleFile:</w:t>
+      </w:r>
+      <w:r>
+        <w:t xml:space="preserve"> </w:t>
+      </w:r>
+      <w:r>
+        <w:t xml:space="preserve">and</w:t>
+      </w:r>
+      <w:r>
+        <w:t xml:space="preserve"> </w:t>
+      </w:r>
+      <w:r>
+        <w:rPr>
+          <w:rStyle w:val="VerbatimChar"/>
+        </w:rPr>
+        <w:t xml:space="preserve">Setting:</w:t>
+      </w:r>
+      <w:r>
+        <w:t xml:space="preserve"> </w:t>
+      </w:r>
+      <w:r>
+        <w:t xml:space="preserve">are absent is the error truly unrecoverable and the exception still thrown.</w:t>
+      </w:r>
+    </w:p>
+    <w:p>
+      <w:pPr>
+        <w:pStyle w:val="Compact"/>
+        <w:numPr>
+          <w:ilvl w:val="0"/>
+          <w:numId w:val="1013"/>
+        </w:numPr>
+      </w:pPr>
+      <w:r>
+        <w:rPr>
+          <w:b/>
+          <w:bCs/>
+        </w:rPr>
+        <w:t xml:space="preserve">Bug 2 —</w:t>
+      </w:r>
+      <w:r>
+        <w:rPr>
+          <w:b/>
+          <w:bCs/>
+        </w:rPr>
+        <w:t xml:space="preserve"> </w:t>
+      </w:r>
+      <w:r>
+        <w:rPr>
+          <w:rStyle w:val="VerbatimChar"/>
+          <w:b/>
+          <w:bCs/>
+        </w:rPr>
+        <w:t xml:space="preserve">_scheduled</w:t>
+      </w:r>
+      <w:r>
+        <w:rPr>
+          <w:b/>
+          <w:bCs/>
+        </w:rPr>
+        <w:t xml:space="preserve"> </w:t>
+      </w:r>
+      <w:r>
+        <w:rPr>
+          <w:b/>
+          <w:bCs/>
+        </w:rPr>
+        <w:t xml:space="preserve">set not cleared on course change blocked coordinator-stage progression.</w:t>
+      </w:r>
+      <w:r>
+        <w:t xml:space="preserve"> </w:t>
+      </w:r>
+      <w:r>
+        <w:rPr>
+          <w:rStyle w:val="VerbatimChar"/>
+        </w:rPr>
+        <w:t xml:space="preserve">ScheduleControl.compute(Change.course)</w:t>
+      </w:r>
+      <w:r>
+        <w:t xml:space="preserve"> </w:t>
+      </w:r>
+      <w:r>
+        <w:t xml:space="preserve">cleared the</w:t>
+      </w:r>
+      <w:r>
+        <w:t xml:space="preserve"> </w:t>
+      </w:r>
+      <w:r>
+        <w:rPr>
+          <w:rStyle w:val="VerbatimChar"/>
+        </w:rPr>
+        <w:t xml:space="preserve">_schedule</w:t>
+      </w:r>
+      <w:r>
+        <w:t xml:space="preserve"> </w:t>
+      </w:r>
+      <w:r>
+        <w:t xml:space="preserve">list (time-slot assignments) but not the</w:t>
+      </w:r>
+      <w:r>
+        <w:t xml:space="preserve"> </w:t>
+      </w:r>
+      <w:r>
+        <w:rPr>
+          <w:rStyle w:val="VerbatimChar"/>
+        </w:rPr>
+        <w:t xml:space="preserve">_scheduled</w:t>
+      </w:r>
+      <w:r>
+        <w:t xml:space="preserve"> </w:t>
+      </w:r>
+      <w:r>
+        <w:t xml:space="preserve">set (membership). After a course split, stale course codes remained in</w:t>
+      </w:r>
+      <w:r>
+        <w:t xml:space="preserve"> </w:t>
+      </w:r>
+      <w:r>
+        <w:rPr>
+          <w:rStyle w:val="VerbatimChar"/>
+        </w:rPr>
+        <w:t xml:space="preserve">_scheduled</w:t>
+      </w:r>
+      <w:r>
+        <w:t xml:space="preserve">, so</w:t>
+      </w:r>
+      <w:r>
+        <w:t xml:space="preserve"> </w:t>
+      </w:r>
+      <w:r>
+        <w:rPr>
+          <w:rStyle w:val="VerbatimChar"/>
+        </w:rPr>
+        <w:t xml:space="preserve">allClassScheduled()</w:t>
+      </w:r>
+      <w:r>
+        <w:t xml:space="preserve"> </w:t>
+      </w:r>
+      <w:r>
+        <w:t xml:space="preserve">returned incorrect results and the UI would not advance from the schedule stage to the coordinator stage. Fix: added</w:t>
+      </w:r>
+      <w:r>
+        <w:t xml:space="preserve"> </w:t>
+      </w:r>
+      <w:r>
+        <w:rPr>
+          <w:rStyle w:val="VerbatimChar"/>
+        </w:rPr>
+        <w:t xml:space="preserve">_scheduled.clear()</w:t>
+      </w:r>
+      <w:r>
+        <w:t xml:space="preserve"> </w:t>
+      </w:r>
+      <w:r>
+        <w:t xml:space="preserve">alongside the existing</w:t>
+      </w:r>
+      <w:r>
+        <w:t xml:space="preserve"> </w:t>
+      </w:r>
+      <w:r>
+        <w:rPr>
+          <w:rStyle w:val="VerbatimChar"/>
+        </w:rPr>
+        <w:t xml:space="preserve">_schedule[i].clear()</w:t>
+      </w:r>
+      <w:r>
+        <w:t xml:space="preserve"> </w:t>
+      </w:r>
+      <w:r>
+        <w:t xml:space="preserve">loop.</w:t>
+      </w:r>
+    </w:p>
+    <w:p>
+      <w:pPr>
+        <w:pStyle w:val="Compact"/>
+        <w:numPr>
+          <w:ilvl w:val="0"/>
+          <w:numId w:val="1013"/>
+        </w:numPr>
+      </w:pPr>
+      <w:r>
+        <w:rPr>
+          <w:b/>
+          <w:bCs/>
+        </w:rPr>
+        <w:t xml:space="preserve">Test additions (1 new test):</w:t>
+      </w:r>
+      <w:r>
+        <w:t xml:space="preserve"> </w:t>
+      </w:r>
+      <w:r>
+        <w:rPr>
+          <w:rStyle w:val="VerbatimChar"/>
+        </w:rPr>
+        <w:t xml:space="preserve">bundled_state_test.dart</w:t>
+      </w:r>
+      <w:r>
+        <w:t xml:space="preserve"> </w:t>
+      </w:r>
+      <w:r>
+        <w:t xml:space="preserve">—</w:t>
+      </w:r>
+      <w:r>
+        <w:t xml:space="preserve"> </w:t>
+      </w:r>
+      <w:r>
+        <w:t xml:space="preserve">“recovers from legacy saves that have CourseFile but no PeopleFile section”</w:t>
+      </w:r>
+      <w:r>
+        <w:t xml:space="preserve">; the existing</w:t>
+      </w:r>
+      <w:r>
+        <w:t xml:space="preserve"> </w:t>
+      </w:r>
+      <w:r>
+        <w:t xml:space="preserve">“throws FormatException when PeopleFile section is missing”</w:t>
+      </w:r>
+      <w:r>
+        <w:t xml:space="preserve"> </w:t>
+      </w:r>
+      <w:r>
+        <w:t xml:space="preserve">test was renamed and updated to cover the only-CourseFile-no-Setting unrecoverable case.</w:t>
+      </w:r>
+    </w:p>
+    <w:p>
+      <w:pPr>
+        <w:pStyle w:val="Compact"/>
+        <w:numPr>
+          <w:ilvl w:val="0"/>
+          <w:numId w:val="1013"/>
+        </w:numPr>
+      </w:pPr>
+      <w:r>
+        <w:rPr>
+          <w:b/>
+          <w:bCs/>
+        </w:rPr>
+        <w:t xml:space="preserve">Suite after fix:</w:t>
+      </w:r>
+      <w:r>
+        <w:t xml:space="preserve"> </w:t>
+      </w:r>
+      <w:r>
+        <w:t xml:space="preserve">21 test files, 99/99 passing.</w:t>
+      </w:r>
+    </w:p>
+    <w:bookmarkEnd w:id="20"/>
+    <w:bookmarkEnd w:id="21"/>
+    <w:bookmarkStart w:id="22" w:name="how-to-write-a-new-entry"/>
+    <w:p>
+      <w:pPr>
+        <w:pStyle w:val="Heading2"/>
+      </w:pPr>
+      <w:r>
+        <w:t xml:space="preserve">How to write a new entry</w:t>
+      </w:r>
+    </w:p>
+    <w:p>
+      <w:pPr>
+        <w:pStyle w:val="FirstParagraph"/>
+      </w:pPr>
+      <w:r>
+        <w:t xml:space="preserve">When a new feature lands post-handoff, append an entry under a new heading</w:t>
+      </w:r>
+      <w:r>
+        <w:t xml:space="preserve"> </w:t>
+      </w:r>
+      <w:r>
+        <w:rPr>
+          <w:b/>
+          <w:bCs/>
+        </w:rPr>
         <w:t xml:space="preserve">dated and one-line-summarized</w:t>
       </w:r>
       <w:r>
@@ -2583,8 +3039,8 @@
         <w:t xml:space="preserve">for end-user-visible behavior changes; keep this file for project-level milestones.</w:t>
       </w:r>
     </w:p>
+    <w:bookmarkEnd w:id="22"/>
     <w:bookmarkEnd w:id="23"/>
-    <w:bookmarkEnd w:id="24"/>
     <w:sectPr>
       <w:footnotePr>
         <w:numRestart w:val="eachSect"/>
@@ -2947,6 +3403,9 @@
     <w:abstractNumId w:val="991"/>
   </w:num>
   <w:num w:numId="1012">
+    <w:abstractNumId w:val="991"/>
+  </w:num>
+  <w:num w:numId="1013">
     <w:abstractNumId w:val="991"/>
   </w:num>
 </w:numbering>

</xml_diff>